<commit_message>
feat: add single-column resume formats and update existing resume assets and previews
</commit_message>
<xml_diff>
--- a/assets/Joao_Eduardo_Santos_Resume.docx
+++ b/assets/Joao_Eduardo_Santos_Resume.docx
@@ -2,1042 +2,644 @@
 <file path=word/document.xml><?xml version="1.0" encoding="utf-8"?>
 <w:document xmlns:wpc="http://schemas.microsoft.com/office/word/2010/wordprocessingCanvas" xmlns:mo="http://schemas.microsoft.com/office/mac/office/2008/main" xmlns:mc="http://schemas.openxmlformats.org/markup-compatibility/2006" xmlns:mv="urn:schemas-microsoft-com:mac:vml" xmlns:o="urn:schemas-microsoft-com:office:office" xmlns:r="http://schemas.openxmlformats.org/officeDocument/2006/relationships" xmlns:m="http://schemas.openxmlformats.org/officeDocument/2006/math" xmlns:v="urn:schemas-microsoft-com:vml" xmlns:wp14="http://schemas.microsoft.com/office/word/2010/wordprocessingDrawing" xmlns:wp="http://schemas.openxmlformats.org/drawingml/2006/wordprocessingDrawing" xmlns:w10="urn:schemas-microsoft-com:office:word" xmlns:w="http://schemas.openxmlformats.org/wordprocessingml/2006/main" xmlns:w14="http://schemas.microsoft.com/office/word/2010/wordml" xmlns:wpg="http://schemas.microsoft.com/office/word/2010/wordprocessingGroup" xmlns:wpi="http://schemas.microsoft.com/office/word/2010/wordprocessingInk" xmlns:wne="http://schemas.microsoft.com/office/word/2006/wordml" xmlns:wps="http://schemas.microsoft.com/office/word/2010/wordprocessingShape" mc:Ignorable="w14 wp14">
   <w:body>
-    <w:tbl>
-      <w:tblPr>
-        <w:tblW w:type="auto" w:w="0"/>
-        <w:jc w:val="center"/>
-        <w:tblLayout w:type="fixed"/>
-        <w:tblLook w:firstColumn="1" w:firstRow="1" w:lastColumn="0" w:lastRow="0" w:noHBand="0" w:noVBand="1" w:val="04A0"/>
-      </w:tblPr>
-      <w:tblGrid>
-        <w:gridCol w:w="5407"/>
-        <w:gridCol w:w="5407"/>
-      </w:tblGrid>
-      <w:tr>
-        <w:tc>
-          <w:tcPr>
-            <w:tcW w:type="dxa" w:w="7344"/>
-            <w:tcMar>
-              <w:top w:w="0" w:type="dxa"/>
-              <w:bottom w:w="40" w:type="dxa"/>
-              <w:left w:w="0" w:type="dxa"/>
-              <w:right w:w="0" w:type="dxa"/>
-            </w:tcMar>
-            <w:tcBorders>
-              <w:top w:val="none"/>
-              <w:bottom w:val="none"/>
-              <w:left w:val="none"/>
-              <w:right w:val="none"/>
-            </w:tcBorders>
-          </w:tcPr>
-          <w:p>
-            <w:pPr>
-              <w:spacing w:before="0" w:after="20"/>
-            </w:pPr>
-            <w:r>
-              <w:rPr>
-                <w:rFonts w:ascii="Arial" w:hAnsi="Arial"/>
-                <w:b/>
-                <w:color w:val="0F172A"/>
-                <w:sz w:val="38"/>
-              </w:rPr>
-              <w:t>João Eduardo Pereira dos Santos</w:t>
-            </w:r>
-          </w:p>
-          <w:p>
-            <w:pPr>
-              <w:spacing w:before="0" w:after="40"/>
-            </w:pPr>
-            <w:r>
-              <w:rPr>
-                <w:rFonts w:ascii="Arial" w:hAnsi="Arial"/>
-                <w:b/>
-                <w:color w:val="0284C7"/>
-                <w:sz w:val="20"/>
-              </w:rPr>
-              <w:t>Senior Python Engineer | Backend, Cloud &amp; AI/LLM Applications</w:t>
-            </w:r>
-          </w:p>
-        </w:tc>
-        <w:tc>
-          <w:tcPr>
-            <w:tcW w:type="dxa" w:w="3456"/>
-            <w:tcMar>
-              <w:top w:w="0" w:type="dxa"/>
-              <w:bottom w:w="40" w:type="dxa"/>
-              <w:left w:w="0" w:type="dxa"/>
-              <w:right w:w="0" w:type="dxa"/>
-            </w:tcMar>
-            <w:tcBorders>
-              <w:top w:val="none"/>
-              <w:bottom w:val="none"/>
-              <w:left w:val="none"/>
-              <w:right w:val="none"/>
-            </w:tcBorders>
-          </w:tcPr>
-          <w:p>
-            <w:pPr>
-              <w:spacing w:before="0" w:after="0" w:line="288" w:lineRule="auto"/>
-              <w:jc w:val="right"/>
-            </w:pPr>
-            <w:r>
-              <w:rPr>
-                <w:rFonts w:ascii="Arial" w:hAnsi="Arial"/>
-                <w:b/>
-                <w:color w:val="64748B"/>
-                <w:sz w:val="15"/>
-              </w:rPr>
-              <w:t>Porto, Portugal</w:t>
-              <w:br/>
-            </w:r>
-            <w:r>
-              <w:rPr>
-                <w:rFonts w:ascii="Arial" w:hAnsi="Arial"/>
-                <w:color w:val="0284C7"/>
-                <w:sz w:val="15"/>
-              </w:rPr>
-              <w:t>(+351) 918 395 324 • joaoedu@gmail.com</w:t>
-              <w:br/>
-            </w:r>
-            <w:r>
-              <w:rPr>
-                <w:rFonts w:ascii="Arial" w:hAnsi="Arial"/>
-                <w:color w:val="0284C7"/>
-                <w:sz w:val="15"/>
-              </w:rPr>
-              <w:t>linkedin.com/in/jepds • dreamkatana.github.io</w:t>
-            </w:r>
-          </w:p>
-        </w:tc>
-      </w:tr>
-    </w:tbl>
     <w:p>
       <w:pPr>
-        <w:spacing w:before="40" w:after="100"/>
+        <w:spacing w:before="0" w:after="20"/>
+        <w:jc w:val="center"/>
+      </w:pPr>
+      <w:r>
+        <w:rPr>
+          <w:rFonts w:ascii="Arial" w:hAnsi="Arial"/>
+          <w:b/>
+          <w:color w:val="0F172A"/>
+          <w:sz w:val="36"/>
+        </w:rPr>
+        <w:t>João Eduardo Pereira dos Santos</w:t>
+      </w:r>
+    </w:p>
+    <w:p>
+      <w:pPr>
+        <w:spacing w:before="0" w:after="40"/>
+        <w:jc w:val="center"/>
+      </w:pPr>
+      <w:r>
+        <w:rPr>
+          <w:rFonts w:ascii="Arial" w:hAnsi="Arial"/>
+          <w:b/>
+          <w:color w:val="0284C7"/>
+          <w:sz w:val="20"/>
+        </w:rPr>
+        <w:t>Senior Python Engineer | Backend, Cloud &amp; AI/LLM Applications</w:t>
+      </w:r>
+    </w:p>
+    <w:p>
+      <w:pPr>
+        <w:spacing w:before="0" w:after="60"/>
+        <w:jc w:val="center"/>
         <w:pBdr>
-          <w:bottom w:val="single" w:sz="16" w:space="1" w:color="0284C7"/>
+          <w:bottom w:val="single" w:sz="12" w:space="2" w:color="0284C7"/>
         </w:pBdr>
       </w:pPr>
+      <w:r>
+        <w:rPr>
+          <w:rFonts w:ascii="Arial" w:hAnsi="Arial"/>
+          <w:color w:val="64748B"/>
+          <w:sz w:val="16"/>
+        </w:rPr>
+        <w:t>Porto, Portugal • (+351) 918 395 324 • joaoedu@gmail.com • linkedin.com/in/jepds • dreamkatana.github.io</w:t>
+      </w:r>
     </w:p>
-    <w:tbl>
-      <w:tblPr>
-        <w:tblW w:type="auto" w:w="0"/>
-        <w:jc w:val="center"/>
-        <w:tblLook w:firstColumn="1" w:firstRow="1" w:lastColumn="0" w:lastRow="0" w:noHBand="0" w:noVBand="1" w:val="04A0"/>
-      </w:tblPr>
-      <w:tblGrid>
-        <w:gridCol w:w="10815"/>
-      </w:tblGrid>
-      <w:tr>
-        <w:tc>
-          <w:tcPr>
-            <w:tcW w:type="dxa" w:w="10800"/>
-            <w:tcMar>
-              <w:top w:w="60" w:type="dxa"/>
-              <w:bottom w:w="60" w:type="dxa"/>
-              <w:left w:w="100" w:type="dxa"/>
-              <w:right w:w="100" w:type="dxa"/>
-            </w:tcMar>
-            <w:shd w:fill="F8FAFC"/>
-            <w:tcBorders>
-              <w:top w:val="none"/>
-              <w:bottom w:val="none"/>
-              <w:left w:val="single" w:sz="18" w:space="0" w:color="0284C7"/>
-              <w:right w:val="none"/>
-            </w:tcBorders>
-          </w:tcPr>
-          <w:p>
-            <w:pPr>
-              <w:spacing w:before="0" w:after="0" w:line="300" w:lineRule="auto"/>
-              <w:jc w:val="both"/>
-            </w:pPr>
-            <w:r>
-              <w:rPr>
-                <w:rFonts w:ascii="Arial" w:hAnsi="Arial"/>
-                <w:b/>
-                <w:color w:val="0F172A"/>
-                <w:sz w:val="16"/>
-              </w:rPr>
-              <w:t>Senior Python Engineer</w:t>
-            </w:r>
-            <w:r>
-              <w:rPr>
-                <w:rFonts w:ascii="Arial" w:hAnsi="Arial"/>
-                <w:b w:val="0"/>
-                <w:color w:val="1E293B"/>
-                <w:sz w:val="16"/>
-              </w:rPr>
-              <w:t xml:space="preserve"> with </w:t>
-            </w:r>
-            <w:r>
-              <w:rPr>
-                <w:rFonts w:ascii="Arial" w:hAnsi="Arial"/>
-                <w:b/>
-                <w:color w:val="0F172A"/>
-                <w:sz w:val="16"/>
-              </w:rPr>
-              <w:t>16+ years of software engineering experience</w:t>
-            </w:r>
-            <w:r>
-              <w:rPr>
-                <w:rFonts w:ascii="Arial" w:hAnsi="Arial"/>
-                <w:b w:val="0"/>
-                <w:color w:val="1E293B"/>
-                <w:sz w:val="16"/>
-              </w:rPr>
-              <w:t xml:space="preserve"> building resilient backend services, REST APIs, enterprise integrations, and data processing solutions. Strong background in </w:t>
-            </w:r>
-            <w:r>
-              <w:rPr>
-                <w:rFonts w:ascii="Arial" w:hAnsi="Arial"/>
-                <w:b/>
-                <w:color w:val="0F172A"/>
-                <w:sz w:val="16"/>
-              </w:rPr>
-              <w:t>Python, SQL</w:t>
-            </w:r>
-            <w:r>
-              <w:rPr>
-                <w:rFonts w:ascii="Arial" w:hAnsi="Arial"/>
-                <w:b w:val="0"/>
-                <w:color w:val="1E293B"/>
-                <w:sz w:val="16"/>
-              </w:rPr>
-              <w:t xml:space="preserve">, relational databases, and cloud-based applications. Currently expanding into AI Engineering through hands-on work with </w:t>
-            </w:r>
-            <w:r>
-              <w:rPr>
-                <w:rFonts w:ascii="Arial" w:hAnsi="Arial"/>
-                <w:b/>
-                <w:color w:val="0F172A"/>
-                <w:sz w:val="16"/>
-              </w:rPr>
-              <w:t>LLMs, Retrieval-Augmented Generation (RAG)</w:t>
-            </w:r>
-            <w:r>
-              <w:rPr>
-                <w:rFonts w:ascii="Arial" w:hAnsi="Arial"/>
-                <w:b w:val="0"/>
-                <w:color w:val="1E293B"/>
-                <w:sz w:val="16"/>
-              </w:rPr>
-              <w:t xml:space="preserve">, embeddings, and AI agents. Experienced in delivering maintainable enterprise solutions across </w:t>
-            </w:r>
-            <w:r>
-              <w:rPr>
-                <w:rFonts w:ascii="Arial" w:hAnsi="Arial"/>
-                <w:b/>
-                <w:color w:val="0F172A"/>
-                <w:sz w:val="16"/>
-              </w:rPr>
-              <w:t>Critical TechWorks, EY, and UNICAMP</w:t>
-            </w:r>
-            <w:r>
-              <w:rPr>
-                <w:rFonts w:ascii="Arial" w:hAnsi="Arial"/>
-                <w:b w:val="0"/>
-                <w:color w:val="1E293B"/>
-                <w:sz w:val="16"/>
-              </w:rPr>
-              <w:t>.</w:t>
-            </w:r>
-          </w:p>
-        </w:tc>
-      </w:tr>
-    </w:tbl>
     <w:p>
       <w:pPr>
-        <w:spacing w:before="60" w:after="0"/>
+        <w:spacing w:before="120" w:after="40" w:line="276" w:lineRule="auto"/>
+        <w:pBdr>
+          <w:bottom w:val="single" w:sz="6" w:space="2" w:color="CBD5E1"/>
+        </w:pBdr>
       </w:pPr>
+      <w:r>
+        <w:rPr>
+          <w:rFonts w:ascii="Arial" w:hAnsi="Arial"/>
+          <w:b/>
+          <w:color w:val="0F172A"/>
+          <w:sz w:val="19"/>
+        </w:rPr>
+        <w:t>■  PROFESSIONAL SUMMARY</w:t>
+      </w:r>
     </w:p>
-    <w:tbl>
-      <w:tblPr>
-        <w:tblW w:type="auto" w:w="0"/>
-        <w:jc w:val="center"/>
-        <w:tblLayout w:type="fixed"/>
-        <w:tblLook w:firstColumn="1" w:firstRow="1" w:lastColumn="0" w:lastRow="0" w:noHBand="0" w:noVBand="1" w:val="04A0"/>
-      </w:tblPr>
-      <w:tblGrid>
-        <w:gridCol w:w="5407"/>
-        <w:gridCol w:w="5407"/>
-      </w:tblGrid>
-      <w:tr>
-        <w:tc>
-          <w:tcPr>
-            <w:tcW w:type="dxa" w:w="7344"/>
-            <w:tcMar>
-              <w:top w:w="0" w:type="dxa"/>
-              <w:bottom w:w="0" w:type="dxa"/>
-              <w:left w:w="0" w:type="dxa"/>
-              <w:right w:w="80" w:type="dxa"/>
-            </w:tcMar>
-            <w:tcBorders>
-              <w:top w:val="none"/>
-              <w:bottom w:val="none"/>
-              <w:left w:val="none"/>
-              <w:right w:val="none"/>
-            </w:tcBorders>
-          </w:tcPr>
-          <w:p/>
-          <w:p>
-            <w:pPr>
-              <w:spacing w:before="100" w:after="60" w:line="276" w:lineRule="auto"/>
-              <w:pBdr>
-                <w:bottom w:val="single" w:sz="6" w:space="2" w:color="CBD5E1"/>
-              </w:pBdr>
-            </w:pPr>
-            <w:r>
-              <w:rPr>
-                <w:rFonts w:ascii="Arial" w:hAnsi="Arial"/>
-                <w:b/>
-                <w:color w:val="0F172A"/>
-                <w:sz w:val="19"/>
-              </w:rPr>
-              <w:t>■  PROFESSIONAL EXPERIENCE</w:t>
-            </w:r>
-          </w:p>
-          <w:p>
-            <w:pPr>
-              <w:spacing w:before="80" w:after="20"/>
-            </w:pPr>
-            <w:r>
-              <w:rPr>
-                <w:rFonts w:ascii="Arial" w:hAnsi="Arial"/>
-                <w:b/>
-                <w:color w:val="0F172A"/>
-                <w:sz w:val="17"/>
-              </w:rPr>
-              <w:t>Python Full Stack Developer</w:t>
-            </w:r>
-            <w:r>
-              <w:rPr>
-                <w:rFonts w:ascii="Arial" w:hAnsi="Arial"/>
-                <w:color w:val="64748B"/>
-                <w:sz w:val="17"/>
-              </w:rPr>
-              <w:t xml:space="preserve"> • </w:t>
-            </w:r>
-            <w:r>
-              <w:rPr>
-                <w:rFonts w:ascii="Arial" w:hAnsi="Arial"/>
-                <w:b/>
-                <w:color w:val="0284C7"/>
-                <w:sz w:val="17"/>
-              </w:rPr>
-              <w:t>Critical TechWorks (BMW Group)</w:t>
-            </w:r>
-          </w:p>
-          <w:p>
-            <w:pPr>
-              <w:spacing w:before="0" w:after="20"/>
-            </w:pPr>
-            <w:r>
-              <w:rPr>
-                <w:rFonts w:ascii="Arial" w:hAnsi="Arial"/>
-                <w:color w:val="64748B"/>
-                <w:sz w:val="15"/>
-              </w:rPr>
-              <w:t>Nov 2025 – Present | Porto, Portugal</w:t>
-            </w:r>
-          </w:p>
-          <w:p>
-            <w:pPr>
-              <w:pStyle w:val="ListBullet"/>
-              <w:spacing w:before="10" w:after="20" w:line="283" w:lineRule="auto"/>
-            </w:pPr>
-            <w:r>
-              <w:rPr>
-                <w:rFonts w:ascii="Arial" w:hAnsi="Arial"/>
-                <w:color w:val="1E293B"/>
-                <w:sz w:val="16"/>
-              </w:rPr>
-              <w:t>Architect and integrate Python backend microservices, REST APIs, and automotive data integration workflows.</w:t>
-            </w:r>
-          </w:p>
-          <w:p>
-            <w:pPr>
-              <w:pStyle w:val="ListBullet"/>
-              <w:spacing w:before="10" w:after="20" w:line="283" w:lineRule="auto"/>
-            </w:pPr>
-            <w:r>
-              <w:rPr>
-                <w:rFonts w:ascii="Arial" w:hAnsi="Arial"/>
-                <w:color w:val="1E293B"/>
-                <w:sz w:val="16"/>
-              </w:rPr>
-              <w:t>Deploy and maintain containerized services using Docker and Kubernetes within AWS cloud environments.</w:t>
-            </w:r>
-          </w:p>
-          <w:p>
-            <w:pPr>
-              <w:pStyle w:val="ListBullet"/>
-              <w:spacing w:before="10" w:after="20" w:line="283" w:lineRule="auto"/>
-            </w:pPr>
-            <w:r>
-              <w:rPr>
-                <w:rFonts w:ascii="Arial" w:hAnsi="Arial"/>
-                <w:color w:val="1E293B"/>
-                <w:sz w:val="16"/>
-              </w:rPr>
-              <w:t>Implement automated CI/CD pipelines, regression test suites, and agile delivery practices (Scrum).</w:t>
-            </w:r>
-          </w:p>
-          <w:p>
-            <w:pPr>
-              <w:pStyle w:val="ListBullet"/>
-              <w:spacing w:before="10" w:after="20" w:line="283" w:lineRule="auto"/>
-            </w:pPr>
-            <w:r>
-              <w:rPr>
-                <w:rFonts w:ascii="Arial" w:hAnsi="Arial"/>
-                <w:color w:val="1E293B"/>
-                <w:sz w:val="16"/>
-              </w:rPr>
-              <w:t>Optimize complex SQL queries, data access layers, and enterprise system connectivity for high availability.</w:t>
-            </w:r>
-          </w:p>
-          <w:p>
-            <w:pPr>
-              <w:pStyle w:val="ListBullet"/>
-              <w:spacing w:before="10" w:after="20" w:line="283" w:lineRule="auto"/>
-            </w:pPr>
-            <w:r>
-              <w:rPr>
-                <w:rFonts w:ascii="Arial" w:hAnsi="Arial"/>
-                <w:color w:val="1E293B"/>
-                <w:sz w:val="16"/>
-              </w:rPr>
-              <w:t>Collaborate with international engineering teams across Portugal and Germany delivering reliable software solutions.</w:t>
-            </w:r>
-          </w:p>
-          <w:p>
-            <w:pPr>
-              <w:spacing w:before="80" w:after="20"/>
-            </w:pPr>
-            <w:r>
-              <w:rPr>
-                <w:rFonts w:ascii="Arial" w:hAnsi="Arial"/>
-                <w:b/>
-                <w:color w:val="0F172A"/>
-                <w:sz w:val="17"/>
-              </w:rPr>
-              <w:t>Python Full Stack Developer</w:t>
-            </w:r>
-            <w:r>
-              <w:rPr>
-                <w:rFonts w:ascii="Arial" w:hAnsi="Arial"/>
-                <w:color w:val="64748B"/>
-                <w:sz w:val="17"/>
-              </w:rPr>
-              <w:t xml:space="preserve"> • </w:t>
-            </w:r>
-            <w:r>
-              <w:rPr>
-                <w:rFonts w:ascii="Arial" w:hAnsi="Arial"/>
-                <w:b/>
-                <w:color w:val="0284C7"/>
-                <w:sz w:val="17"/>
-              </w:rPr>
-              <w:t>Ernst &amp; Young (EY)</w:t>
-            </w:r>
-          </w:p>
-          <w:p>
-            <w:pPr>
-              <w:spacing w:before="0" w:after="20"/>
-            </w:pPr>
-            <w:r>
-              <w:rPr>
-                <w:rFonts w:ascii="Arial" w:hAnsi="Arial"/>
-                <w:color w:val="64748B"/>
-                <w:sz w:val="15"/>
-              </w:rPr>
-              <w:t>Dec 2022 – Nov 2025 | Brazil / Hybrid</w:t>
-            </w:r>
-          </w:p>
-          <w:p>
-            <w:pPr>
-              <w:pStyle w:val="ListBullet"/>
-              <w:spacing w:before="10" w:after="20" w:line="283" w:lineRule="auto"/>
-            </w:pPr>
-            <w:r>
-              <w:rPr>
-                <w:rFonts w:ascii="Arial" w:hAnsi="Arial"/>
-                <w:color w:val="1E293B"/>
-                <w:sz w:val="16"/>
-              </w:rPr>
-              <w:t>Developed a Python-based Retrieval-Augmented Generation (RAG) prototype for semantic search and Q&amp;A over internal document sets.</w:t>
-            </w:r>
-          </w:p>
-          <w:p>
-            <w:pPr>
-              <w:pStyle w:val="ListBullet"/>
-              <w:spacing w:before="10" w:after="20" w:line="283" w:lineRule="auto"/>
-            </w:pPr>
-            <w:r>
-              <w:rPr>
-                <w:rFonts w:ascii="Arial" w:hAnsi="Arial"/>
-                <w:color w:val="1E293B"/>
-                <w:sz w:val="16"/>
-              </w:rPr>
-              <w:t>Engineered document ingestion, chunking pipelines, vector embeddings, and LLM query-response workflows.</w:t>
-            </w:r>
-          </w:p>
-          <w:p>
-            <w:pPr>
-              <w:pStyle w:val="ListBullet"/>
-              <w:spacing w:before="10" w:after="20" w:line="283" w:lineRule="auto"/>
-            </w:pPr>
-            <w:r>
-              <w:rPr>
-                <w:rFonts w:ascii="Arial" w:hAnsi="Arial"/>
-                <w:color w:val="1E293B"/>
-                <w:sz w:val="16"/>
-              </w:rPr>
-              <w:t>Delivered enterprise data integration pipelines for SAP migration projects, including extraction, transformation, and validation.</w:t>
-            </w:r>
-          </w:p>
-          <w:p>
-            <w:pPr>
-              <w:pStyle w:val="ListBullet"/>
-              <w:spacing w:before="10" w:after="20" w:line="283" w:lineRule="auto"/>
-            </w:pPr>
-            <w:r>
-              <w:rPr>
-                <w:rFonts w:ascii="Arial" w:hAnsi="Arial"/>
-                <w:color w:val="1E293B"/>
-                <w:sz w:val="16"/>
-              </w:rPr>
-              <w:t>Developed and maintained ETL workflows using IBM DataStage and custom Python data processing scripts.</w:t>
-            </w:r>
-          </w:p>
-          <w:p>
-            <w:pPr>
-              <w:pStyle w:val="ListBullet"/>
-              <w:spacing w:before="10" w:after="20" w:line="283" w:lineRule="auto"/>
-            </w:pPr>
-            <w:r>
-              <w:rPr>
-                <w:rFonts w:ascii="Arial" w:hAnsi="Arial"/>
-                <w:color w:val="1E293B"/>
-                <w:sz w:val="16"/>
-              </w:rPr>
-              <w:t>Authored complex SQL transformations, automated data validation routines, and operational reporting dashboards.</w:t>
-            </w:r>
-          </w:p>
-          <w:p>
-            <w:pPr>
-              <w:spacing w:before="80" w:after="20"/>
-            </w:pPr>
-            <w:r>
-              <w:rPr>
-                <w:rFonts w:ascii="Arial" w:hAnsi="Arial"/>
-                <w:b/>
-                <w:color w:val="0F172A"/>
-                <w:sz w:val="17"/>
-              </w:rPr>
-              <w:t>Senior Systems Engineer &amp; Python Developer</w:t>
-            </w:r>
-            <w:r>
-              <w:rPr>
-                <w:rFonts w:ascii="Arial" w:hAnsi="Arial"/>
-                <w:color w:val="64748B"/>
-                <w:sz w:val="17"/>
-              </w:rPr>
-              <w:t xml:space="preserve"> • </w:t>
-            </w:r>
-            <w:r>
-              <w:rPr>
-                <w:rFonts w:ascii="Arial" w:hAnsi="Arial"/>
-                <w:b/>
-                <w:color w:val="0284C7"/>
-                <w:sz w:val="17"/>
-              </w:rPr>
-              <w:t>UNICAMP</w:t>
-            </w:r>
-          </w:p>
-          <w:p>
-            <w:pPr>
-              <w:spacing w:before="0" w:after="20"/>
-            </w:pPr>
-            <w:r>
-              <w:rPr>
-                <w:rFonts w:ascii="Arial" w:hAnsi="Arial"/>
-                <w:color w:val="64748B"/>
-                <w:sz w:val="15"/>
-              </w:rPr>
-              <w:t>Apr 2008 – Dec 2022 (14+ yrs) | Brazil</w:t>
-            </w:r>
-          </w:p>
-          <w:p>
-            <w:pPr>
-              <w:pStyle w:val="ListBullet"/>
-              <w:spacing w:before="10" w:after="20" w:line="283" w:lineRule="auto"/>
-            </w:pPr>
-            <w:r>
-              <w:rPr>
-                <w:rFonts w:ascii="Arial" w:hAnsi="Arial"/>
-                <w:color w:val="1E293B"/>
-                <w:sz w:val="16"/>
-              </w:rPr>
-              <w:t>Engineered scalable web applications, RESTful APIs, and administrative platforms using Python (Django, Flask) and SQL.</w:t>
-            </w:r>
-          </w:p>
-          <w:p>
-            <w:pPr>
-              <w:pStyle w:val="ListBullet"/>
-              <w:spacing w:before="10" w:after="20" w:line="283" w:lineRule="auto"/>
-            </w:pPr>
-            <w:r>
-              <w:rPr>
-                <w:rFonts w:ascii="Arial" w:hAnsi="Arial"/>
-                <w:color w:val="1E293B"/>
-                <w:sz w:val="16"/>
-              </w:rPr>
-              <w:t>Architected and delivered core administrative and academic portal backends serving over 40,000 university users.</w:t>
-            </w:r>
-          </w:p>
-          <w:p>
-            <w:pPr>
-              <w:pStyle w:val="ListBullet"/>
-              <w:spacing w:before="10" w:after="20" w:line="283" w:lineRule="auto"/>
-            </w:pPr>
-            <w:r>
-              <w:rPr>
-                <w:rFonts w:ascii="Arial" w:hAnsi="Arial"/>
-                <w:color w:val="1E293B"/>
-                <w:sz w:val="16"/>
-              </w:rPr>
-              <w:t>Designed, optimized, and administered mission-critical relational databases (PostgreSQL, Oracle, MySQL).</w:t>
-            </w:r>
-          </w:p>
-          <w:p>
-            <w:pPr>
-              <w:pStyle w:val="ListBullet"/>
-              <w:spacing w:before="10" w:after="20" w:line="283" w:lineRule="auto"/>
-            </w:pPr>
-            <w:r>
-              <w:rPr>
-                <w:rFonts w:ascii="Arial" w:hAnsi="Arial"/>
-                <w:color w:val="1E293B"/>
-                <w:sz w:val="16"/>
-              </w:rPr>
-              <w:t>Spearheaded digital transformation initiatives, DevOps automation, and Linux server infrastructure management.</w:t>
-            </w:r>
-          </w:p>
-          <w:p>
-            <w:pPr>
-              <w:pStyle w:val="ListBullet"/>
-              <w:spacing w:before="10" w:after="20" w:line="283" w:lineRule="auto"/>
-            </w:pPr>
-            <w:r>
-              <w:rPr>
-                <w:rFonts w:ascii="Arial" w:hAnsi="Arial"/>
-                <w:color w:val="1E293B"/>
-                <w:sz w:val="16"/>
-              </w:rPr>
-              <w:t>Automated complex institutional data extraction, BI reporting pipelines, and routine operational workflows.</w:t>
-            </w:r>
-          </w:p>
-          <w:p>
-            <w:pPr>
-              <w:spacing w:before="80" w:after="0" w:line="288" w:lineRule="auto"/>
-            </w:pPr>
-            <w:r>
-              <w:rPr>
-                <w:rFonts w:ascii="Arial" w:hAnsi="Arial"/>
-                <w:b/>
-                <w:color w:val="0F172A"/>
-                <w:sz w:val="15"/>
-              </w:rPr>
-              <w:t xml:space="preserve">Earlier Career: </w:t>
-            </w:r>
-            <w:r>
-              <w:rPr>
-                <w:rFonts w:ascii="Arial" w:hAnsi="Arial"/>
-                <w:color w:val="64748B"/>
-                <w:sz w:val="15"/>
-              </w:rPr>
-              <w:t>Digital Games Programming Instructor at SESC Santana (2016–2019; Python, Lua, game logic) • Software &amp; Data Analyst at Mercer Brasil (2005–2008; SQL Server, ETL, database integration) • Technical Support at Atento (2001–2002).</w:t>
-            </w:r>
-          </w:p>
-        </w:tc>
-        <w:tc>
-          <w:tcPr>
-            <w:tcW w:type="dxa" w:w="3456"/>
-            <w:tcMar>
-              <w:top w:w="0" w:type="dxa"/>
-              <w:bottom w:w="0" w:type="dxa"/>
-              <w:left w:w="60" w:type="dxa"/>
-              <w:right w:w="0" w:type="dxa"/>
-            </w:tcMar>
-            <w:tcBorders>
-              <w:top w:val="none"/>
-              <w:bottom w:val="none"/>
-              <w:left w:val="none"/>
-              <w:right w:val="none"/>
-            </w:tcBorders>
-          </w:tcPr>
-          <w:p/>
-          <w:p>
-            <w:pPr>
-              <w:spacing w:before="100" w:after="60" w:line="276" w:lineRule="auto"/>
-              <w:pBdr>
-                <w:bottom w:val="single" w:sz="6" w:space="2" w:color="CBD5E1"/>
-              </w:pBdr>
-            </w:pPr>
-            <w:r>
-              <w:rPr>
-                <w:rFonts w:ascii="Arial" w:hAnsi="Arial"/>
-                <w:b/>
-                <w:color w:val="0F172A"/>
-                <w:sz w:val="19"/>
-              </w:rPr>
-              <w:t>■  TECHNICAL SKILLS</w:t>
-            </w:r>
-          </w:p>
-          <w:p>
-            <w:pPr>
-              <w:spacing w:before="60" w:after="20"/>
-            </w:pPr>
-            <w:r>
-              <w:rPr>
-                <w:rFonts w:ascii="Arial" w:hAnsi="Arial"/>
-                <w:b/>
-                <w:color w:val="0F172A"/>
-                <w:sz w:val="15"/>
-              </w:rPr>
-              <w:t>Backend Engineering</w:t>
-            </w:r>
-          </w:p>
-          <w:p>
-            <w:pPr>
-              <w:spacing w:before="0" w:after="40" w:line="283" w:lineRule="auto"/>
-            </w:pPr>
-            <w:r>
-              <w:rPr>
-                <w:rFonts w:ascii="Arial" w:hAnsi="Arial"/>
-                <w:color w:val="1E293B"/>
-                <w:sz w:val="14"/>
-              </w:rPr>
-              <w:t>Python, FastAPI, Flask, Django, REST APIs, AsyncIO</w:t>
-            </w:r>
-          </w:p>
-          <w:p>
-            <w:pPr>
-              <w:spacing w:before="60" w:after="20"/>
-            </w:pPr>
-            <w:r>
-              <w:rPr>
-                <w:rFonts w:ascii="Arial" w:hAnsi="Arial"/>
-                <w:b/>
-                <w:color w:val="0F172A"/>
-                <w:sz w:val="15"/>
-              </w:rPr>
-              <w:t>AI &amp; LLM Applications</w:t>
-            </w:r>
-          </w:p>
-          <w:p>
-            <w:pPr>
-              <w:spacing w:before="0" w:after="40" w:line="283" w:lineRule="auto"/>
-            </w:pPr>
-            <w:r>
-              <w:rPr>
-                <w:rFonts w:ascii="Arial" w:hAnsi="Arial"/>
-                <w:color w:val="1E293B"/>
-                <w:sz w:val="14"/>
-              </w:rPr>
-              <w:t>LLM Integration, RAG Architectures, Doc Ingestion &amp; Chunking, Embeddings, Semantic Retrieval, Prompt Engineering, AI Agents, Vector Databases</w:t>
-            </w:r>
-          </w:p>
-          <w:p>
-            <w:pPr>
-              <w:spacing w:before="60" w:after="20"/>
-            </w:pPr>
-            <w:r>
-              <w:rPr>
-                <w:rFonts w:ascii="Arial" w:hAnsi="Arial"/>
-                <w:b/>
-                <w:color w:val="0F172A"/>
-                <w:sz w:val="15"/>
-              </w:rPr>
-              <w:t>Databases &amp; Data Engineering</w:t>
-            </w:r>
-          </w:p>
-          <w:p>
-            <w:pPr>
-              <w:spacing w:before="0" w:after="40" w:line="283" w:lineRule="auto"/>
-            </w:pPr>
-            <w:r>
-              <w:rPr>
-                <w:rFonts w:ascii="Arial" w:hAnsi="Arial"/>
-                <w:color w:val="1E293B"/>
-                <w:sz w:val="14"/>
-              </w:rPr>
-              <w:t>PostgreSQL, Oracle DB, MySQL, SQL Server, SQL Optimization, ETL / ELT, IBM DataStage, SAP Migration</w:t>
-            </w:r>
-          </w:p>
-          <w:p>
-            <w:pPr>
-              <w:spacing w:before="60" w:after="20"/>
-            </w:pPr>
-            <w:r>
-              <w:rPr>
-                <w:rFonts w:ascii="Arial" w:hAnsi="Arial"/>
-                <w:b/>
-                <w:color w:val="0F172A"/>
-                <w:sz w:val="15"/>
-              </w:rPr>
-              <w:t>Cloud &amp; DevOps</w:t>
-            </w:r>
-          </w:p>
-          <w:p>
-            <w:pPr>
-              <w:spacing w:before="0" w:after="40" w:line="283" w:lineRule="auto"/>
-            </w:pPr>
-            <w:r>
-              <w:rPr>
-                <w:rFonts w:ascii="Arial" w:hAnsi="Arial"/>
-                <w:color w:val="1E293B"/>
-                <w:sz w:val="14"/>
-              </w:rPr>
-              <w:t>AWS, Docker, Kubernetes, Git, CI/CD, Jenkins, Linux</w:t>
-            </w:r>
-          </w:p>
-          <w:p>
-            <w:pPr>
-              <w:spacing w:before="60" w:after="20"/>
-            </w:pPr>
-            <w:r>
-              <w:rPr>
-                <w:rFonts w:ascii="Arial" w:hAnsi="Arial"/>
-                <w:b/>
-                <w:color w:val="0F172A"/>
-                <w:sz w:val="15"/>
-              </w:rPr>
-              <w:t>Architecture &amp; Practices</w:t>
-            </w:r>
-          </w:p>
-          <w:p>
-            <w:pPr>
-              <w:spacing w:before="0" w:after="40" w:line="283" w:lineRule="auto"/>
-            </w:pPr>
-            <w:r>
-              <w:rPr>
-                <w:rFonts w:ascii="Arial" w:hAnsi="Arial"/>
-                <w:color w:val="1E293B"/>
-                <w:sz w:val="14"/>
-              </w:rPr>
-              <w:t>Clean Architecture, Microservices, Enterprise Integration, Unit Testing, Agile / Scrum</w:t>
-            </w:r>
-          </w:p>
-          <w:p>
-            <w:pPr>
-              <w:spacing w:before="100" w:after="60" w:line="276" w:lineRule="auto"/>
-              <w:pBdr>
-                <w:bottom w:val="single" w:sz="6" w:space="2" w:color="CBD5E1"/>
-              </w:pBdr>
-            </w:pPr>
-            <w:r>
-              <w:rPr>
-                <w:rFonts w:ascii="Arial" w:hAnsi="Arial"/>
-                <w:b/>
-                <w:color w:val="0F172A"/>
-                <w:sz w:val="19"/>
-              </w:rPr>
-              <w:t>■  EDUCATION &amp; TRAINING</w:t>
-            </w:r>
-          </w:p>
-          <w:p>
-            <w:pPr>
-              <w:spacing w:before="40" w:after="0"/>
-            </w:pPr>
-            <w:r>
-              <w:rPr>
-                <w:rFonts w:ascii="Arial" w:hAnsi="Arial"/>
-                <w:b/>
-                <w:color w:val="0F172A"/>
-                <w:sz w:val="15"/>
-              </w:rPr>
-              <w:t>B.S. Computer Engineering</w:t>
-            </w:r>
-          </w:p>
-          <w:p>
-            <w:pPr>
-              <w:spacing w:before="0" w:after="40"/>
-            </w:pPr>
-            <w:r>
-              <w:rPr>
-                <w:rFonts w:ascii="Arial" w:hAnsi="Arial"/>
-                <w:color w:val="0284C7"/>
-                <w:sz w:val="14"/>
-              </w:rPr>
-              <w:t>UNIVESP (Brazil)</w:t>
-            </w:r>
-            <w:r>
-              <w:rPr>
-                <w:rFonts w:ascii="Arial" w:hAnsi="Arial"/>
-                <w:color w:val="64748B"/>
-                <w:sz w:val="14"/>
-              </w:rPr>
-              <w:t xml:space="preserve"> • 2019 – Present (In progress)</w:t>
-            </w:r>
-          </w:p>
-          <w:p>
-            <w:pPr>
-              <w:spacing w:before="40" w:after="0"/>
-            </w:pPr>
-            <w:r>
-              <w:rPr>
-                <w:rFonts w:ascii="Arial" w:hAnsi="Arial"/>
-                <w:b/>
-                <w:color w:val="0F172A"/>
-                <w:sz w:val="15"/>
-              </w:rPr>
-              <w:t>Data Processing Technologist</w:t>
-            </w:r>
-          </w:p>
-          <w:p>
-            <w:pPr>
-              <w:spacing w:before="0" w:after="40"/>
-            </w:pPr>
-            <w:r>
-              <w:rPr>
-                <w:rFonts w:ascii="Arial" w:hAnsi="Arial"/>
-                <w:color w:val="0284C7"/>
-                <w:sz w:val="14"/>
-              </w:rPr>
-              <w:t>FATEC-SP (Brazil)</w:t>
-            </w:r>
-            <w:r>
-              <w:rPr>
-                <w:rFonts w:ascii="Arial" w:hAnsi="Arial"/>
-                <w:color w:val="64748B"/>
-                <w:sz w:val="14"/>
-              </w:rPr>
-              <w:t xml:space="preserve"> • 2003 – 2007</w:t>
-            </w:r>
-          </w:p>
-          <w:p>
-            <w:pPr>
-              <w:spacing w:before="40" w:after="0"/>
-            </w:pPr>
-            <w:r>
-              <w:rPr>
-                <w:rFonts w:ascii="Arial" w:hAnsi="Arial"/>
-                <w:b/>
-                <w:color w:val="0F172A"/>
-                <w:sz w:val="15"/>
-              </w:rPr>
-              <w:t>Building Web Apps in Django</w:t>
-            </w:r>
-          </w:p>
-          <w:p>
-            <w:pPr>
-              <w:spacing w:before="0" w:after="40"/>
-            </w:pPr>
-            <w:r>
-              <w:rPr>
-                <w:rFonts w:ascii="Arial" w:hAnsi="Arial"/>
-                <w:color w:val="0284C7"/>
-                <w:sz w:val="14"/>
-              </w:rPr>
-              <w:t>University of Michigan</w:t>
-            </w:r>
-          </w:p>
-          <w:p>
-            <w:pPr>
-              <w:spacing w:before="40" w:after="0"/>
-            </w:pPr>
-            <w:r>
-              <w:rPr>
-                <w:rFonts w:ascii="Arial" w:hAnsi="Arial"/>
-                <w:b/>
-                <w:color w:val="0F172A"/>
-                <w:sz w:val="15"/>
-              </w:rPr>
-              <w:t>Full Stack Developer Program</w:t>
-            </w:r>
-          </w:p>
-          <w:p>
-            <w:pPr>
-              <w:spacing w:before="0" w:after="40"/>
-            </w:pPr>
-            <w:r>
-              <w:rPr>
-                <w:rFonts w:ascii="Arial" w:hAnsi="Arial"/>
-                <w:color w:val="0284C7"/>
-                <w:sz w:val="14"/>
-              </w:rPr>
-              <w:t>PUC-Rio</w:t>
-            </w:r>
-          </w:p>
-          <w:p>
-            <w:pPr>
-              <w:spacing w:before="100" w:after="60" w:line="276" w:lineRule="auto"/>
-              <w:pBdr>
-                <w:bottom w:val="single" w:sz="6" w:space="2" w:color="CBD5E1"/>
-              </w:pBdr>
-            </w:pPr>
-            <w:r>
-              <w:rPr>
-                <w:rFonts w:ascii="Arial" w:hAnsi="Arial"/>
-                <w:b/>
-                <w:color w:val="0F172A"/>
-                <w:sz w:val="19"/>
-              </w:rPr>
-              <w:t>■  LANGUAGES</w:t>
-            </w:r>
-          </w:p>
-          <w:p>
-            <w:pPr>
-              <w:spacing w:before="30" w:after="20"/>
-            </w:pPr>
-            <w:r>
-              <w:rPr>
-                <w:rFonts w:ascii="Arial" w:hAnsi="Arial"/>
-                <w:color w:val="1E293B"/>
-                <w:sz w:val="15"/>
-              </w:rPr>
-              <w:t xml:space="preserve">English: </w:t>
-            </w:r>
-            <w:r>
-              <w:rPr>
-                <w:rFonts w:ascii="Arial" w:hAnsi="Arial"/>
-                <w:b/>
-                <w:color w:val="0284C7"/>
-                <w:sz w:val="15"/>
-              </w:rPr>
-              <w:t>C2 Proficient / Mastery</w:t>
-            </w:r>
-          </w:p>
-          <w:p>
-            <w:pPr>
-              <w:spacing w:before="30" w:after="20"/>
-            </w:pPr>
-            <w:r>
-              <w:rPr>
-                <w:rFonts w:ascii="Arial" w:hAnsi="Arial"/>
-                <w:color w:val="1E293B"/>
-                <w:sz w:val="15"/>
-              </w:rPr>
-              <w:t xml:space="preserve">Portuguese: </w:t>
-            </w:r>
-            <w:r>
-              <w:rPr>
-                <w:rFonts w:ascii="Arial" w:hAnsi="Arial"/>
-                <w:b/>
-                <w:color w:val="0284C7"/>
-                <w:sz w:val="15"/>
-              </w:rPr>
-              <w:t>Native</w:t>
-            </w:r>
-          </w:p>
-        </w:tc>
-      </w:tr>
-    </w:tbl>
+    <w:p>
+      <w:pPr>
+        <w:spacing w:before="20" w:after="60" w:line="288" w:lineRule="auto"/>
+      </w:pPr>
+      <w:r>
+        <w:rPr>
+          <w:rFonts w:ascii="Arial" w:hAnsi="Arial"/>
+          <w:b/>
+          <w:color w:val="0F172A"/>
+          <w:sz w:val="16"/>
+        </w:rPr>
+        <w:t>Senior Python Engineer</w:t>
+      </w:r>
+      <w:r>
+        <w:rPr>
+          <w:rFonts w:ascii="Arial" w:hAnsi="Arial"/>
+          <w:b w:val="0"/>
+          <w:color w:val="1E293B"/>
+          <w:sz w:val="16"/>
+        </w:rPr>
+        <w:t xml:space="preserve"> with </w:t>
+      </w:r>
+      <w:r>
+        <w:rPr>
+          <w:rFonts w:ascii="Arial" w:hAnsi="Arial"/>
+          <w:b/>
+          <w:color w:val="0F172A"/>
+          <w:sz w:val="16"/>
+        </w:rPr>
+        <w:t>16+ years of software engineering experience</w:t>
+      </w:r>
+      <w:r>
+        <w:rPr>
+          <w:rFonts w:ascii="Arial" w:hAnsi="Arial"/>
+          <w:b w:val="0"/>
+          <w:color w:val="1E293B"/>
+          <w:sz w:val="16"/>
+        </w:rPr>
+        <w:t xml:space="preserve"> building resilient backend services, REST APIs, enterprise integrations, and data processing solutions. Strong background in </w:t>
+      </w:r>
+      <w:r>
+        <w:rPr>
+          <w:rFonts w:ascii="Arial" w:hAnsi="Arial"/>
+          <w:b/>
+          <w:color w:val="0F172A"/>
+          <w:sz w:val="16"/>
+        </w:rPr>
+        <w:t>Python, SQL</w:t>
+      </w:r>
+      <w:r>
+        <w:rPr>
+          <w:rFonts w:ascii="Arial" w:hAnsi="Arial"/>
+          <w:b w:val="0"/>
+          <w:color w:val="1E293B"/>
+          <w:sz w:val="16"/>
+        </w:rPr>
+        <w:t xml:space="preserve">, relational databases, and cloud-based applications. Currently expanding into AI Engineering through hands-on work with </w:t>
+      </w:r>
+      <w:r>
+        <w:rPr>
+          <w:rFonts w:ascii="Arial" w:hAnsi="Arial"/>
+          <w:b/>
+          <w:color w:val="0F172A"/>
+          <w:sz w:val="16"/>
+        </w:rPr>
+        <w:t>LLMs, Retrieval-Augmented Generation (RAG)</w:t>
+      </w:r>
+      <w:r>
+        <w:rPr>
+          <w:rFonts w:ascii="Arial" w:hAnsi="Arial"/>
+          <w:b w:val="0"/>
+          <w:color w:val="1E293B"/>
+          <w:sz w:val="16"/>
+        </w:rPr>
+        <w:t xml:space="preserve">, embeddings, and AI agents. Experienced in delivering maintainable enterprise solutions across </w:t>
+      </w:r>
+      <w:r>
+        <w:rPr>
+          <w:rFonts w:ascii="Arial" w:hAnsi="Arial"/>
+          <w:b/>
+          <w:color w:val="0F172A"/>
+          <w:sz w:val="16"/>
+        </w:rPr>
+        <w:t>Critical TechWorks, EY, and UNICAMP</w:t>
+      </w:r>
+      <w:r>
+        <w:rPr>
+          <w:rFonts w:ascii="Arial" w:hAnsi="Arial"/>
+          <w:b w:val="0"/>
+          <w:color w:val="1E293B"/>
+          <w:sz w:val="16"/>
+        </w:rPr>
+        <w:t>.</w:t>
+      </w:r>
+    </w:p>
+    <w:p>
+      <w:pPr>
+        <w:spacing w:before="120" w:after="40" w:line="276" w:lineRule="auto"/>
+        <w:pBdr>
+          <w:bottom w:val="single" w:sz="6" w:space="2" w:color="CBD5E1"/>
+        </w:pBdr>
+      </w:pPr>
+      <w:r>
+        <w:rPr>
+          <w:rFonts w:ascii="Arial" w:hAnsi="Arial"/>
+          <w:b/>
+          <w:color w:val="0F172A"/>
+          <w:sz w:val="19"/>
+        </w:rPr>
+        <w:t>■  TECHNICAL SKILLS</w:t>
+      </w:r>
+    </w:p>
+    <w:p>
+      <w:pPr>
+        <w:spacing w:before="10" w:after="20" w:line="276" w:lineRule="auto"/>
+      </w:pPr>
+      <w:r>
+        <w:rPr>
+          <w:rFonts w:ascii="Arial" w:hAnsi="Arial"/>
+          <w:b/>
+          <w:color w:val="0F172A"/>
+          <w:sz w:val="16"/>
+        </w:rPr>
+        <w:t xml:space="preserve">Backend Engineering: </w:t>
+      </w:r>
+      <w:r>
+        <w:rPr>
+          <w:rFonts w:ascii="Arial" w:hAnsi="Arial"/>
+          <w:color w:val="1E293B"/>
+          <w:sz w:val="16"/>
+        </w:rPr>
+        <w:t>Python, FastAPI, Flask, Django, REST APIs, AsyncIO, Microservices, Clean Architecture</w:t>
+      </w:r>
+    </w:p>
+    <w:p>
+      <w:pPr>
+        <w:spacing w:before="10" w:after="20" w:line="276" w:lineRule="auto"/>
+      </w:pPr>
+      <w:r>
+        <w:rPr>
+          <w:rFonts w:ascii="Arial" w:hAnsi="Arial"/>
+          <w:b/>
+          <w:color w:val="0F172A"/>
+          <w:sz w:val="16"/>
+        </w:rPr>
+        <w:t xml:space="preserve">AI &amp; LLM Applications: </w:t>
+      </w:r>
+      <w:r>
+        <w:rPr>
+          <w:rFonts w:ascii="Arial" w:hAnsi="Arial"/>
+          <w:color w:val="1E293B"/>
+          <w:sz w:val="16"/>
+        </w:rPr>
+        <w:t>LLM Integration, Retrieval-Augmented Generation (RAG), Document Ingestion &amp; Chunking, Embeddings, Semantic Retrieval, Prompt Engineering, AI Agents, Vector Databases</w:t>
+      </w:r>
+    </w:p>
+    <w:p>
+      <w:pPr>
+        <w:spacing w:before="10" w:after="20" w:line="276" w:lineRule="auto"/>
+      </w:pPr>
+      <w:r>
+        <w:rPr>
+          <w:rFonts w:ascii="Arial" w:hAnsi="Arial"/>
+          <w:b/>
+          <w:color w:val="0F172A"/>
+          <w:sz w:val="16"/>
+        </w:rPr>
+        <w:t xml:space="preserve">Databases &amp; Data Engineering: </w:t>
+      </w:r>
+      <w:r>
+        <w:rPr>
+          <w:rFonts w:ascii="Arial" w:hAnsi="Arial"/>
+          <w:color w:val="1E293B"/>
+          <w:sz w:val="16"/>
+        </w:rPr>
+        <w:t>PostgreSQL, Oracle DB, MySQL, SQL Server, SQL Optimization, ETL / ELT, IBM DataStage, SAP Migration</w:t>
+      </w:r>
+    </w:p>
+    <w:p>
+      <w:pPr>
+        <w:spacing w:before="10" w:after="20" w:line="276" w:lineRule="auto"/>
+      </w:pPr>
+      <w:r>
+        <w:rPr>
+          <w:rFonts w:ascii="Arial" w:hAnsi="Arial"/>
+          <w:b/>
+          <w:color w:val="0F172A"/>
+          <w:sz w:val="16"/>
+        </w:rPr>
+        <w:t xml:space="preserve">Cloud, DevOps &amp; Practices: </w:t>
+      </w:r>
+      <w:r>
+        <w:rPr>
+          <w:rFonts w:ascii="Arial" w:hAnsi="Arial"/>
+          <w:color w:val="1E293B"/>
+          <w:sz w:val="16"/>
+        </w:rPr>
+        <w:t>AWS, Docker, Kubernetes, Git, CI/CD, Jenkins, Linux, Unit Testing, Agile / Scrum</w:t>
+      </w:r>
+    </w:p>
+    <w:p>
+      <w:pPr>
+        <w:spacing w:before="120" w:after="40" w:line="276" w:lineRule="auto"/>
+        <w:pBdr>
+          <w:bottom w:val="single" w:sz="6" w:space="2" w:color="CBD5E1"/>
+        </w:pBdr>
+      </w:pPr>
+      <w:r>
+        <w:rPr>
+          <w:rFonts w:ascii="Arial" w:hAnsi="Arial"/>
+          <w:b/>
+          <w:color w:val="0F172A"/>
+          <w:sz w:val="19"/>
+        </w:rPr>
+        <w:t>■  PROFESSIONAL EXPERIENCE</w:t>
+      </w:r>
+    </w:p>
+    <w:p>
+      <w:pPr>
+        <w:spacing w:before="70" w:after="10"/>
+      </w:pPr>
+      <w:r>
+        <w:rPr>
+          <w:rFonts w:ascii="Arial" w:hAnsi="Arial"/>
+          <w:b/>
+          <w:color w:val="0F172A"/>
+          <w:sz w:val="17"/>
+        </w:rPr>
+        <w:t>Python Full Stack Developer • Critical TechWorks (BMW Group)</w:t>
+      </w:r>
+      <w:r>
+        <w:rPr>
+          <w:rFonts w:ascii="Arial" w:hAnsi="Arial"/>
+          <w:color w:val="64748B"/>
+          <w:sz w:val="15"/>
+        </w:rPr>
+        <w:t xml:space="preserve">    (Nov 2025 – Present | Porto, Portugal)</w:t>
+      </w:r>
+    </w:p>
+    <w:p>
+      <w:pPr>
+        <w:pStyle w:val="ListBullet"/>
+        <w:spacing w:before="10" w:after="10" w:line="276" w:lineRule="auto"/>
+      </w:pPr>
+      <w:r>
+        <w:rPr>
+          <w:rFonts w:ascii="Arial" w:hAnsi="Arial"/>
+          <w:color w:val="1E293B"/>
+          <w:sz w:val="16"/>
+        </w:rPr>
+        <w:t>Architect and integrate Python backend microservices, REST APIs, and automotive data integration workflows.</w:t>
+      </w:r>
+    </w:p>
+    <w:p>
+      <w:pPr>
+        <w:pStyle w:val="ListBullet"/>
+        <w:spacing w:before="10" w:after="10" w:line="276" w:lineRule="auto"/>
+      </w:pPr>
+      <w:r>
+        <w:rPr>
+          <w:rFonts w:ascii="Arial" w:hAnsi="Arial"/>
+          <w:color w:val="1E293B"/>
+          <w:sz w:val="16"/>
+        </w:rPr>
+        <w:t>Deploy and maintain containerized services using Docker and Kubernetes within AWS cloud environments.</w:t>
+      </w:r>
+    </w:p>
+    <w:p>
+      <w:pPr>
+        <w:pStyle w:val="ListBullet"/>
+        <w:spacing w:before="10" w:after="10" w:line="276" w:lineRule="auto"/>
+      </w:pPr>
+      <w:r>
+        <w:rPr>
+          <w:rFonts w:ascii="Arial" w:hAnsi="Arial"/>
+          <w:color w:val="1E293B"/>
+          <w:sz w:val="16"/>
+        </w:rPr>
+        <w:t>Implement automated CI/CD pipelines, regression test suites, and agile delivery practices (Scrum).</w:t>
+      </w:r>
+    </w:p>
+    <w:p>
+      <w:pPr>
+        <w:pStyle w:val="ListBullet"/>
+        <w:spacing w:before="10" w:after="10" w:line="276" w:lineRule="auto"/>
+      </w:pPr>
+      <w:r>
+        <w:rPr>
+          <w:rFonts w:ascii="Arial" w:hAnsi="Arial"/>
+          <w:color w:val="1E293B"/>
+          <w:sz w:val="16"/>
+        </w:rPr>
+        <w:t>Optimize complex SQL queries, data access layers, and enterprise system connectivity for high availability.</w:t>
+      </w:r>
+    </w:p>
+    <w:p>
+      <w:pPr>
+        <w:pStyle w:val="ListBullet"/>
+        <w:spacing w:before="10" w:after="10" w:line="276" w:lineRule="auto"/>
+      </w:pPr>
+      <w:r>
+        <w:rPr>
+          <w:rFonts w:ascii="Arial" w:hAnsi="Arial"/>
+          <w:color w:val="1E293B"/>
+          <w:sz w:val="16"/>
+        </w:rPr>
+        <w:t>Collaborate with international engineering teams across Portugal and Germany delivering reliable software solutions.</w:t>
+      </w:r>
+    </w:p>
+    <w:p>
+      <w:pPr>
+        <w:spacing w:before="70" w:after="10"/>
+      </w:pPr>
+      <w:r>
+        <w:rPr>
+          <w:rFonts w:ascii="Arial" w:hAnsi="Arial"/>
+          <w:b/>
+          <w:color w:val="0F172A"/>
+          <w:sz w:val="17"/>
+        </w:rPr>
+        <w:t>Python Full Stack Developer • Ernst &amp; Young (EY)</w:t>
+      </w:r>
+      <w:r>
+        <w:rPr>
+          <w:rFonts w:ascii="Arial" w:hAnsi="Arial"/>
+          <w:color w:val="64748B"/>
+          <w:sz w:val="15"/>
+        </w:rPr>
+        <w:t xml:space="preserve">    (Dec 2022 – Nov 2025 | Brazil / Hybrid)</w:t>
+      </w:r>
+    </w:p>
+    <w:p>
+      <w:pPr>
+        <w:pStyle w:val="ListBullet"/>
+        <w:spacing w:before="10" w:after="10" w:line="276" w:lineRule="auto"/>
+      </w:pPr>
+      <w:r>
+        <w:rPr>
+          <w:rFonts w:ascii="Arial" w:hAnsi="Arial"/>
+          <w:color w:val="1E293B"/>
+          <w:sz w:val="16"/>
+        </w:rPr>
+        <w:t>Developed a Python-based Retrieval-Augmented Generation (RAG) prototype for semantic search and Q&amp;A over internal document sets.</w:t>
+      </w:r>
+    </w:p>
+    <w:p>
+      <w:pPr>
+        <w:pStyle w:val="ListBullet"/>
+        <w:spacing w:before="10" w:after="10" w:line="276" w:lineRule="auto"/>
+      </w:pPr>
+      <w:r>
+        <w:rPr>
+          <w:rFonts w:ascii="Arial" w:hAnsi="Arial"/>
+          <w:color w:val="1E293B"/>
+          <w:sz w:val="16"/>
+        </w:rPr>
+        <w:t>Engineered document ingestion, chunking pipelines, vector embeddings, and LLM query-response workflows.</w:t>
+      </w:r>
+    </w:p>
+    <w:p>
+      <w:pPr>
+        <w:pStyle w:val="ListBullet"/>
+        <w:spacing w:before="10" w:after="10" w:line="276" w:lineRule="auto"/>
+      </w:pPr>
+      <w:r>
+        <w:rPr>
+          <w:rFonts w:ascii="Arial" w:hAnsi="Arial"/>
+          <w:color w:val="1E293B"/>
+          <w:sz w:val="16"/>
+        </w:rPr>
+        <w:t>Delivered enterprise data integration pipelines for SAP migration projects, including extraction, transformation, and validation.</w:t>
+      </w:r>
+    </w:p>
+    <w:p>
+      <w:pPr>
+        <w:pStyle w:val="ListBullet"/>
+        <w:spacing w:before="10" w:after="10" w:line="276" w:lineRule="auto"/>
+      </w:pPr>
+      <w:r>
+        <w:rPr>
+          <w:rFonts w:ascii="Arial" w:hAnsi="Arial"/>
+          <w:color w:val="1E293B"/>
+          <w:sz w:val="16"/>
+        </w:rPr>
+        <w:t>Developed and maintained ETL workflows using IBM DataStage and custom Python data processing scripts.</w:t>
+      </w:r>
+    </w:p>
+    <w:p>
+      <w:pPr>
+        <w:pStyle w:val="ListBullet"/>
+        <w:spacing w:before="10" w:after="10" w:line="276" w:lineRule="auto"/>
+      </w:pPr>
+      <w:r>
+        <w:rPr>
+          <w:rFonts w:ascii="Arial" w:hAnsi="Arial"/>
+          <w:color w:val="1E293B"/>
+          <w:sz w:val="16"/>
+        </w:rPr>
+        <w:t>Authored complex SQL transformations, automated data validation routines, and operational reporting dashboards.</w:t>
+      </w:r>
+    </w:p>
+    <w:p>
+      <w:pPr>
+        <w:spacing w:before="70" w:after="10"/>
+      </w:pPr>
+      <w:r>
+        <w:rPr>
+          <w:rFonts w:ascii="Arial" w:hAnsi="Arial"/>
+          <w:b/>
+          <w:color w:val="0F172A"/>
+          <w:sz w:val="17"/>
+        </w:rPr>
+        <w:t>Senior Systems Engineer &amp; Python Developer • UNICAMP</w:t>
+      </w:r>
+      <w:r>
+        <w:rPr>
+          <w:rFonts w:ascii="Arial" w:hAnsi="Arial"/>
+          <w:color w:val="64748B"/>
+          <w:sz w:val="15"/>
+        </w:rPr>
+        <w:t xml:space="preserve">    (Apr 2008 – Dec 2022 (14+ yrs) | Brazil)</w:t>
+      </w:r>
+    </w:p>
+    <w:p>
+      <w:pPr>
+        <w:pStyle w:val="ListBullet"/>
+        <w:spacing w:before="10" w:after="10" w:line="276" w:lineRule="auto"/>
+      </w:pPr>
+      <w:r>
+        <w:rPr>
+          <w:rFonts w:ascii="Arial" w:hAnsi="Arial"/>
+          <w:color w:val="1E293B"/>
+          <w:sz w:val="16"/>
+        </w:rPr>
+        <w:t>Engineered scalable web applications, RESTful APIs, and administrative platforms using Python (Django, Flask) and SQL.</w:t>
+      </w:r>
+    </w:p>
+    <w:p>
+      <w:pPr>
+        <w:pStyle w:val="ListBullet"/>
+        <w:spacing w:before="10" w:after="10" w:line="276" w:lineRule="auto"/>
+      </w:pPr>
+      <w:r>
+        <w:rPr>
+          <w:rFonts w:ascii="Arial" w:hAnsi="Arial"/>
+          <w:color w:val="1E293B"/>
+          <w:sz w:val="16"/>
+        </w:rPr>
+        <w:t>Architected and delivered core administrative and academic portal backends serving over 40,000 university users.</w:t>
+      </w:r>
+    </w:p>
+    <w:p>
+      <w:pPr>
+        <w:pStyle w:val="ListBullet"/>
+        <w:spacing w:before="10" w:after="10" w:line="276" w:lineRule="auto"/>
+      </w:pPr>
+      <w:r>
+        <w:rPr>
+          <w:rFonts w:ascii="Arial" w:hAnsi="Arial"/>
+          <w:color w:val="1E293B"/>
+          <w:sz w:val="16"/>
+        </w:rPr>
+        <w:t>Designed, optimized, and administered mission-critical relational databases (PostgreSQL, Oracle, MySQL).</w:t>
+      </w:r>
+    </w:p>
+    <w:p>
+      <w:pPr>
+        <w:pStyle w:val="ListBullet"/>
+        <w:spacing w:before="10" w:after="10" w:line="276" w:lineRule="auto"/>
+      </w:pPr>
+      <w:r>
+        <w:rPr>
+          <w:rFonts w:ascii="Arial" w:hAnsi="Arial"/>
+          <w:color w:val="1E293B"/>
+          <w:sz w:val="16"/>
+        </w:rPr>
+        <w:t>Spearheaded digital transformation initiatives, DevOps automation, and Linux server infrastructure management.</w:t>
+      </w:r>
+    </w:p>
+    <w:p>
+      <w:pPr>
+        <w:pStyle w:val="ListBullet"/>
+        <w:spacing w:before="10" w:after="10" w:line="276" w:lineRule="auto"/>
+      </w:pPr>
+      <w:r>
+        <w:rPr>
+          <w:rFonts w:ascii="Arial" w:hAnsi="Arial"/>
+          <w:color w:val="1E293B"/>
+          <w:sz w:val="16"/>
+        </w:rPr>
+        <w:t>Automated complex institutional data extraction, BI reporting pipelines, and routine operational workflows.</w:t>
+      </w:r>
+    </w:p>
+    <w:p>
+      <w:pPr>
+        <w:spacing w:before="60" w:after="20" w:line="283" w:lineRule="auto"/>
+      </w:pPr>
+      <w:r>
+        <w:rPr>
+          <w:rFonts w:ascii="Arial" w:hAnsi="Arial"/>
+          <w:b/>
+          <w:color w:val="0F172A"/>
+          <w:sz w:val="15"/>
+        </w:rPr>
+        <w:t xml:space="preserve">Earlier Career: </w:t>
+      </w:r>
+      <w:r>
+        <w:rPr>
+          <w:rFonts w:ascii="Arial" w:hAnsi="Arial"/>
+          <w:color w:val="64748B"/>
+          <w:sz w:val="15"/>
+        </w:rPr>
+        <w:t>Digital Games Programming Instructor at SESC Santana (2016–2019; Python, Lua, game logic) • Software &amp; Data Analyst at Mercer Brasil (2005–2008; SQL Server, ETL, database integration) • Technical Support at Atento (2001–2002).</w:t>
+      </w:r>
+    </w:p>
+    <w:p>
+      <w:pPr>
+        <w:spacing w:before="120" w:after="40" w:line="276" w:lineRule="auto"/>
+        <w:pBdr>
+          <w:bottom w:val="single" w:sz="6" w:space="2" w:color="CBD5E1"/>
+        </w:pBdr>
+      </w:pPr>
+      <w:r>
+        <w:rPr>
+          <w:rFonts w:ascii="Arial" w:hAnsi="Arial"/>
+          <w:b/>
+          <w:color w:val="0F172A"/>
+          <w:sz w:val="19"/>
+        </w:rPr>
+        <w:t>■  EDUCATION, TRAINING &amp; LANGUAGES</w:t>
+      </w:r>
+    </w:p>
+    <w:p>
+      <w:pPr>
+        <w:spacing w:before="20" w:after="10"/>
+      </w:pPr>
+      <w:r>
+        <w:rPr>
+          <w:rFonts w:ascii="Arial" w:hAnsi="Arial"/>
+          <w:color w:val="1E293B"/>
+          <w:sz w:val="16"/>
+        </w:rPr>
+        <w:t>• B.S. Computer Engineering – UNIVESP (Brazil) [2019 – Present (In progress)]    • Data Processing Technologist – FATEC-SP [2003 – 2007]</w:t>
+      </w:r>
+    </w:p>
+    <w:p>
+      <w:pPr>
+        <w:spacing w:before="10" w:after="0"/>
+      </w:pPr>
+      <w:r>
+        <w:rPr>
+          <w:rFonts w:ascii="Arial" w:hAnsi="Arial"/>
+          <w:color w:val="1E293B"/>
+          <w:sz w:val="16"/>
+        </w:rPr>
+        <w:t>• Certifications &amp; Courses: Building Web Apps in Django (Univ. of Michigan) • Full Stack Developer Program (PUC-Rio)</w:t>
+      </w:r>
+    </w:p>
+    <w:p>
+      <w:pPr>
+        <w:spacing w:before="10" w:after="0"/>
+      </w:pPr>
+      <w:r>
+        <w:rPr>
+          <w:rFonts w:ascii="Arial" w:hAnsi="Arial"/>
+          <w:color w:val="1E293B"/>
+          <w:sz w:val="16"/>
+        </w:rPr>
+        <w:t>• Languages: English (C2 Proficient / Mastery) • Portuguese (Native)</w:t>
+      </w:r>
+    </w:p>
     <w:sectPr>
       <w:pgSz w:w="11909" w:h="16834"/>
-      <w:pgMar w:top="461" w:right="547" w:bottom="461" w:left="547" w:header="720" w:footer="720" w:gutter="0"/>
+      <w:pgMar w:top="547" w:right="691" w:bottom="547" w:left="691" w:header="720" w:footer="720" w:gutter="0"/>
       <w:cols w:space="720"/>
       <w:docGrid w:linePitch="360"/>
     </w:sectPr>

</xml_diff>